<commit_message>
docs: saneamento de auditoria (Fase 6 em andamento, RNF06 projetado, captcha->RNF01, T-14+RF08, T-19 fim, nota dev x merge, revisão por pares)
Co-Authored-By: Claude Opus 4.8 (1M context) <noreply@anthropic.com>
</commit_message>
<xml_diff>
--- a/mps-nivel-c/oficial/04_registros/AASP_CNJ/GCO-AASPCNJ01-001_Registro-de-Configuracao.docx
+++ b/mps-nivel-c/oficial/04_registros/AASP_CNJ/GCO-AASPCNJ01-001_Registro-de-Configuracao.docx
@@ -3071,17 +3071,8 @@
             </w:tcMar>
           </w:tcPr>
           <w:p>
-            <w:pPr>
-              <w:spacing w:before="40" w:after="40"/>
-            </w:pPr>
             <w:r>
-              <w:rPr>
-                <w:rFonts w:ascii="Calibri" w:hAnsi="Calibri"/>
-                <w:b w:val="0"/>
-                <w:i w:val="0"/>
-                <w:sz w:val="20"/>
-              </w:rPr>
-              <w:t>PR com no mínimo 1 revisor além do autor (ver REV-AASPCNJ01-001)</w:t>
+              <w:t>PR com no mínimo 1 revisor além do autor (ver REV-AASPCNJ01-001) (no Azure DevOps o merge exige aprovação de ≥1 revisor via branch policy)</w:t>
             </w:r>
           </w:p>
         </w:tc>

</xml_diff>

<commit_message>
auditoria geral (CNJ/AASPCNJ01): registros alinhados ao GitLab
- reconciliacao dos registros do projeto (GCO, ITP, REV, GEST) ao estado atual do instance aasp/cnj

Co-Authored-By: Claude Opus 4.8 <noreply@anthropic.com>
</commit_message>
<xml_diff>
--- a/mps-nivel-c/oficial/04_registros/AASP_CNJ/GCO-AASPCNJ01-001_Registro-de-Configuracao.docx
+++ b/mps-nivel-c/oficial/04_registros/AASP_CNJ/GCO-AASPCNJ01-001_Registro-de-Configuracao.docx
@@ -34,7 +34,7 @@
           <w:color w:val="555555"/>
           <w:sz w:val="20"/>
         </w:rPr>
-        <w:t>GCO-AASPCNJ01-001   ·   Versão 1.1   ·   17/06/2026   ·   Timeware Brasil</w:t>
+        <w:t>GCO-AASPCNJ01-001   ·   Versão 1.2   ·   17/06/2026   ·   Timeware Brasil</w:t>
       </w:r>
     </w:p>
     <w:p>
@@ -976,7 +976,7 @@
                 <w:i w:val="0"/>
                 <w:sz w:val="20"/>
               </w:rPr>
-              <w:t xml:space="preserve">Mínimo 1 revisor além do autor para merge de </w:t>
+              <w:t xml:space="preserve">Mínimo 2 revisores além do autor para merge de </w:t>
             </w:r>
             <w:r>
               <w:rPr>
@@ -3058,7 +3058,7 @@
           </w:tcPr>
           <w:p>
             <w:r>
-              <w:t>MR com no mínimo 1 revisor além do autor (ver REV-AASPCNJ01-001) (no GitLab o merge exige aprovação de ≥1 revisor via branch policy)</w:t>
+              <w:t>MR com no mínimo 2 revisores além do autor (ver REV-AASPCNJ01-001) (no GitLab o merge exige aprovação de ≥2 revisores via branch policy)</w:t>
             </w:r>
           </w:p>
         </w:tc>
@@ -3430,6 +3430,48 @@
           </w:p>
         </w:tc>
       </w:tr>
+      <w:tr>
+        <w:tc>
+          <w:tcPr>
+            <w:tcW w:type="dxa" w:w="2225"/>
+          </w:tcPr>
+          <w:p>
+            <w:r>
+              <w:t>1.2</w:t>
+            </w:r>
+          </w:p>
+        </w:tc>
+        <w:tc>
+          <w:tcPr>
+            <w:tcW w:type="dxa" w:w="2225"/>
+          </w:tcPr>
+          <w:p>
+            <w:r>
+              <w:t>24/06/2026</w:t>
+            </w:r>
+          </w:p>
+        </w:tc>
+        <w:tc>
+          <w:tcPr>
+            <w:tcW w:type="dxa" w:w="2225"/>
+          </w:tcPr>
+          <w:p>
+            <w:r>
+              <w:t>Time de Melhoria Contínua</w:t>
+            </w:r>
+          </w:p>
+        </w:tc>
+        <w:tc>
+          <w:tcPr>
+            <w:tcW w:type="dxa" w:w="2225"/>
+          </w:tcPr>
+          <w:p>
+            <w:r>
+              <w:t>Reconciliação com o GitLab: política de MR para 2 revisores além do autor (antes 1).</w:t>
+            </w:r>
+          </w:p>
+        </w:tc>
+      </w:tr>
     </w:tbl>
     <w:p>
       <w:pPr>

</xml_diff>